<commit_message>
Test scripts and authentication/endpoint updates
Updates to user journey test scripts, emergency contacts endpoint, leaving
process endpoint, Supabase authentication tests, E2E infrastructure, and
identity module changes.

Co-Authored-By: Claude Haiku 4.5 <noreply@anthropic.com>
</commit_message>
<xml_diff>
--- a/Test Scripts/User Journey/UJ001-CustomerCreatesTrialCompany.docx
+++ b/Test Scripts/User Journey/UJ001-CustomerCreatesTrialCompany.docx
@@ -4,10 +4,933 @@
   <w:body>
     <w:p>
       <w:pPr>
-        <w:pStyle w:val="Heading1"/>
+        <w:pStyle w:val="Title"/>
+        <w:spacing w:after="40"/>
       </w:pPr>
       <w:r>
-        <w:t>UJ001-CustomerCreatesTrialCompany</w:t>
+        <w:t>Customer creates a trial company</w:t>
+      </w:r>
+    </w:p>
+    <w:p>
+      <w:pPr>
+        <w:spacing w:after="200"/>
+      </w:pPr>
+      <w:r>
+        <w:rPr>
+          <w:rFonts w:ascii="Aptos" w:hAnsi="Aptos"/>
+          <w:b/>
+          <w:color w:val="64748B"/>
+          <w:sz w:val="18"/>
+        </w:rPr>
+        <w:t>UJ001  |  User acceptance test  |  Version 2.0</w:t>
+      </w:r>
+    </w:p>
+    <w:p>
+      <w:pPr>
+        <w:spacing w:after="200"/>
+      </w:pPr>
+      <w:r>
+        <w:t>Confirm that a new customer can register, verify their email, create a company and arrive at a useful setup experience with the correct initial administrator access.</w:t>
+      </w:r>
+    </w:p>
+    <w:tbl>
+      <w:tblPr>
+        <w:tblW w:type="auto" w:w="0"/>
+        <w:jc w:val="center"/>
+        <w:tblLayout w:type="fixed"/>
+        <w:tblLook w:firstColumn="1" w:firstRow="1" w:lastColumn="0" w:lastRow="0" w:noHBand="0" w:noVBand="1" w:val="04A0"/>
+      </w:tblPr>
+      <w:tblGrid>
+        <w:gridCol w:w="2232"/>
+        <w:gridCol w:w="7992"/>
+      </w:tblGrid>
+      <w:tr>
+        <w:trPr>
+          <w:cantSplit/>
+        </w:trPr>
+        <w:tc>
+          <w:tcPr>
+            <w:tcW w:type="dxa" w:w="2232"/>
+            <w:vAlign w:val="center"/>
+            <w:tcMar>
+              <w:top w:w="65" w:type="dxa"/>
+              <w:start w:w="110" w:type="dxa"/>
+              <w:bottom w:w="65" w:type="dxa"/>
+              <w:end w:w="110" w:type="dxa"/>
+            </w:tcMar>
+            <w:shd w:fill="2F5597"/>
+          </w:tcPr>
+          <w:p>
+            <w:pPr>
+              <w:spacing w:after="0" w:line="252" w:lineRule="auto"/>
+            </w:pPr>
+            <w:r/>
+            <w:r>
+              <w:rPr>
+                <w:rFonts w:ascii="Aptos" w:hAnsi="Aptos"/>
+                <w:b/>
+                <w:color w:val="FFFFFF"/>
+                <w:sz w:val="18"/>
+              </w:rPr>
+              <w:t>Primary tester</w:t>
+            </w:r>
+          </w:p>
+        </w:tc>
+        <w:tc>
+          <w:tcPr>
+            <w:tcW w:type="dxa" w:w="7992"/>
+            <w:vAlign w:val="center"/>
+            <w:tcMar>
+              <w:top w:w="65" w:type="dxa"/>
+              <w:start w:w="110" w:type="dxa"/>
+              <w:bottom w:w="65" w:type="dxa"/>
+              <w:end w:w="110" w:type="dxa"/>
+            </w:tcMar>
+            <w:shd w:fill="FFFFFF"/>
+          </w:tcPr>
+          <w:p>
+            <w:pPr>
+              <w:spacing w:after="0" w:line="252" w:lineRule="auto"/>
+            </w:pPr>
+            <w:r/>
+            <w:r>
+              <w:rPr>
+                <w:rFonts w:ascii="Aptos" w:hAnsi="Aptos"/>
+                <w:b w:val="0"/>
+                <w:sz w:val="18"/>
+              </w:rPr>
+              <w:t>New customer / company creator</w:t>
+            </w:r>
+          </w:p>
+        </w:tc>
+      </w:tr>
+      <w:tr>
+        <w:trPr>
+          <w:cantSplit/>
+        </w:trPr>
+        <w:tc>
+          <w:tcPr>
+            <w:tcW w:type="dxa" w:w="2232"/>
+            <w:vAlign w:val="center"/>
+            <w:tcMar>
+              <w:top w:w="65" w:type="dxa"/>
+              <w:start w:w="110" w:type="dxa"/>
+              <w:bottom w:w="65" w:type="dxa"/>
+              <w:end w:w="110" w:type="dxa"/>
+            </w:tcMar>
+            <w:shd w:fill="2F5597"/>
+          </w:tcPr>
+          <w:p>
+            <w:pPr>
+              <w:spacing w:after="0" w:line="252" w:lineRule="auto"/>
+            </w:pPr>
+            <w:r/>
+            <w:r>
+              <w:rPr>
+                <w:rFonts w:ascii="Aptos" w:hAnsi="Aptos"/>
+                <w:b/>
+                <w:color w:val="FFFFFF"/>
+                <w:sz w:val="18"/>
+              </w:rPr>
+              <w:t>Starting state</w:t>
+            </w:r>
+          </w:p>
+        </w:tc>
+        <w:tc>
+          <w:tcPr>
+            <w:tcW w:type="dxa" w:w="7992"/>
+            <w:vAlign w:val="center"/>
+            <w:tcMar>
+              <w:top w:w="65" w:type="dxa"/>
+              <w:start w:w="110" w:type="dxa"/>
+              <w:bottom w:w="65" w:type="dxa"/>
+              <w:end w:w="110" w:type="dxa"/>
+            </w:tcMar>
+            <w:shd w:fill="F3F5F7"/>
+          </w:tcPr>
+          <w:p>
+            <w:pPr>
+              <w:spacing w:after="0" w:line="252" w:lineRule="auto"/>
+            </w:pPr>
+            <w:r/>
+            <w:r>
+              <w:rPr>
+                <w:rFonts w:ascii="Aptos" w:hAnsi="Aptos"/>
+                <w:b w:val="0"/>
+                <w:sz w:val="18"/>
+              </w:rPr>
+              <w:t>Use an email address that is not already registered. Email delivery must be available in the test environment.</w:t>
+            </w:r>
+          </w:p>
+        </w:tc>
+      </w:tr>
+      <w:tr>
+        <w:trPr>
+          <w:cantSplit/>
+        </w:trPr>
+        <w:tc>
+          <w:tcPr>
+            <w:tcW w:type="dxa" w:w="2232"/>
+            <w:vAlign w:val="center"/>
+            <w:tcMar>
+              <w:top w:w="65" w:type="dxa"/>
+              <w:start w:w="110" w:type="dxa"/>
+              <w:bottom w:w="65" w:type="dxa"/>
+              <w:end w:w="110" w:type="dxa"/>
+            </w:tcMar>
+            <w:shd w:fill="2F5597"/>
+          </w:tcPr>
+          <w:p>
+            <w:pPr>
+              <w:spacing w:after="0" w:line="252" w:lineRule="auto"/>
+            </w:pPr>
+            <w:r/>
+            <w:r>
+              <w:rPr>
+                <w:rFonts w:ascii="Aptos" w:hAnsi="Aptos"/>
+                <w:b/>
+                <w:color w:val="FFFFFF"/>
+                <w:sz w:val="18"/>
+              </w:rPr>
+              <w:t>Test data</w:t>
+            </w:r>
+          </w:p>
+        </w:tc>
+        <w:tc>
+          <w:tcPr>
+            <w:tcW w:type="dxa" w:w="7992"/>
+            <w:vAlign w:val="center"/>
+            <w:tcMar>
+              <w:top w:w="65" w:type="dxa"/>
+              <w:start w:w="110" w:type="dxa"/>
+              <w:bottom w:w="65" w:type="dxa"/>
+              <w:end w:w="110" w:type="dxa"/>
+            </w:tcMar>
+            <w:shd w:fill="FFFFFF"/>
+          </w:tcPr>
+          <w:p>
+            <w:pPr>
+              <w:spacing w:after="0" w:line="252" w:lineRule="auto"/>
+            </w:pPr>
+            <w:r/>
+            <w:r>
+              <w:rPr>
+                <w:rFonts w:ascii="Aptos" w:hAnsi="Aptos"/>
+                <w:b w:val="0"/>
+                <w:sz w:val="18"/>
+              </w:rPr>
+              <w:t>Unique work email; strong password; company name; UK locale and time zone; a second browser or private window for the verification link.</w:t>
+            </w:r>
+          </w:p>
+        </w:tc>
+      </w:tr>
+      <w:tr>
+        <w:trPr>
+          <w:cantSplit/>
+        </w:trPr>
+        <w:tc>
+          <w:tcPr>
+            <w:tcW w:type="dxa" w:w="2232"/>
+            <w:vAlign w:val="center"/>
+            <w:tcMar>
+              <w:top w:w="65" w:type="dxa"/>
+              <w:start w:w="110" w:type="dxa"/>
+              <w:bottom w:w="65" w:type="dxa"/>
+              <w:end w:w="110" w:type="dxa"/>
+            </w:tcMar>
+            <w:shd w:fill="2F5597"/>
+          </w:tcPr>
+          <w:p>
+            <w:pPr>
+              <w:spacing w:after="0" w:line="252" w:lineRule="auto"/>
+            </w:pPr>
+            <w:r/>
+            <w:r>
+              <w:rPr>
+                <w:rFonts w:ascii="Aptos" w:hAnsi="Aptos"/>
+                <w:b/>
+                <w:color w:val="FFFFFF"/>
+                <w:sz w:val="18"/>
+              </w:rPr>
+              <w:t>Manual scope</w:t>
+            </w:r>
+          </w:p>
+        </w:tc>
+        <w:tc>
+          <w:tcPr>
+            <w:tcW w:type="dxa" w:w="7992"/>
+            <w:vAlign w:val="center"/>
+            <w:tcMar>
+              <w:top w:w="65" w:type="dxa"/>
+              <w:start w:w="110" w:type="dxa"/>
+              <w:bottom w:w="65" w:type="dxa"/>
+              <w:end w:w="110" w:type="dxa"/>
+            </w:tcMar>
+            <w:shd w:fill="F3F5F7"/>
+          </w:tcPr>
+          <w:p>
+            <w:pPr>
+              <w:spacing w:after="0" w:line="252" w:lineRule="auto"/>
+            </w:pPr>
+            <w:r/>
+            <w:r>
+              <w:rPr>
+                <w:rFonts w:ascii="Aptos" w:hAnsi="Aptos"/>
+                <w:b w:val="0"/>
+                <w:sz w:val="18"/>
+              </w:rPr>
+              <w:t>Manual test covers the successful end-to-end outcome only. Validation, permissions, security, failure and boundary cases are covered by Playwright and other automated checks.</w:t>
+            </w:r>
+          </w:p>
+        </w:tc>
+      </w:tr>
+    </w:tbl>
+    <w:p/>
+    <w:p>
+      <w:pPr>
+        <w:pStyle w:val="Heading2"/>
+      </w:pPr>
+      <w:r>
+        <w:t>Journey steps</w:t>
+      </w:r>
+    </w:p>
+    <w:tbl>
+      <w:tblPr>
+        <w:tblW w:type="auto" w:w="0"/>
+        <w:jc w:val="center"/>
+        <w:tblLayout w:type="fixed"/>
+        <w:tblLook w:firstColumn="1" w:firstRow="1" w:lastColumn="0" w:lastRow="0" w:noHBand="0" w:noVBand="1" w:val="04A0"/>
+      </w:tblPr>
+      <w:tblGrid>
+        <w:gridCol w:w="691"/>
+        <w:gridCol w:w="3816"/>
+        <w:gridCol w:w="5832"/>
+      </w:tblGrid>
+      <w:tr>
+        <w:trPr>
+          <w:tblHeader w:val="true"/>
+          <w:cantSplit/>
+        </w:trPr>
+        <w:tc>
+          <w:tcPr>
+            <w:tcW w:type="dxa" w:w="691"/>
+            <w:vAlign w:val="center"/>
+            <w:tcMar>
+              <w:top w:w="65" w:type="dxa"/>
+              <w:start w:w="110" w:type="dxa"/>
+              <w:bottom w:w="65" w:type="dxa"/>
+              <w:end w:w="110" w:type="dxa"/>
+            </w:tcMar>
+            <w:shd w:fill="17365D"/>
+          </w:tcPr>
+          <w:p>
+            <w:pPr>
+              <w:spacing w:after="0" w:line="252" w:lineRule="auto"/>
+            </w:pPr>
+            <w:r/>
+            <w:r>
+              <w:rPr>
+                <w:rFonts w:ascii="Aptos" w:hAnsi="Aptos"/>
+                <w:b/>
+                <w:color w:val="FFFFFF"/>
+                <w:sz w:val="18"/>
+              </w:rPr>
+              <w:t>#</w:t>
+            </w:r>
+          </w:p>
+        </w:tc>
+        <w:tc>
+          <w:tcPr>
+            <w:tcW w:type="dxa" w:w="3816"/>
+            <w:vAlign w:val="center"/>
+            <w:tcMar>
+              <w:top w:w="65" w:type="dxa"/>
+              <w:start w:w="110" w:type="dxa"/>
+              <w:bottom w:w="65" w:type="dxa"/>
+              <w:end w:w="110" w:type="dxa"/>
+            </w:tcMar>
+            <w:shd w:fill="17365D"/>
+          </w:tcPr>
+          <w:p>
+            <w:pPr>
+              <w:spacing w:after="0" w:line="252" w:lineRule="auto"/>
+            </w:pPr>
+            <w:r/>
+            <w:r>
+              <w:rPr>
+                <w:rFonts w:ascii="Aptos" w:hAnsi="Aptos"/>
+                <w:b/>
+                <w:color w:val="FFFFFF"/>
+                <w:sz w:val="18"/>
+              </w:rPr>
+              <w:t>Action</w:t>
+            </w:r>
+          </w:p>
+        </w:tc>
+        <w:tc>
+          <w:tcPr>
+            <w:tcW w:type="dxa" w:w="5832"/>
+            <w:vAlign w:val="center"/>
+            <w:tcMar>
+              <w:top w:w="65" w:type="dxa"/>
+              <w:start w:w="110" w:type="dxa"/>
+              <w:bottom w:w="65" w:type="dxa"/>
+              <w:end w:w="110" w:type="dxa"/>
+            </w:tcMar>
+            <w:shd w:fill="17365D"/>
+          </w:tcPr>
+          <w:p>
+            <w:pPr>
+              <w:spacing w:after="0" w:line="252" w:lineRule="auto"/>
+            </w:pPr>
+            <w:r/>
+            <w:r>
+              <w:rPr>
+                <w:rFonts w:ascii="Aptos" w:hAnsi="Aptos"/>
+                <w:b/>
+                <w:color w:val="FFFFFF"/>
+                <w:sz w:val="18"/>
+              </w:rPr>
+              <w:t>Expected result / evidence</w:t>
+            </w:r>
+          </w:p>
+        </w:tc>
+      </w:tr>
+      <w:tr>
+        <w:trPr>
+          <w:cantSplit/>
+        </w:trPr>
+        <w:tc>
+          <w:tcPr>
+            <w:tcW w:type="dxa" w:w="691"/>
+            <w:vAlign w:val="center"/>
+            <w:tcMar>
+              <w:top w:w="65" w:type="dxa"/>
+              <w:start w:w="110" w:type="dxa"/>
+              <w:bottom w:w="65" w:type="dxa"/>
+              <w:end w:w="110" w:type="dxa"/>
+            </w:tcMar>
+          </w:tcPr>
+          <w:p>
+            <w:pPr>
+              <w:spacing w:after="0" w:line="252" w:lineRule="auto"/>
+              <w:jc w:val="center"/>
+            </w:pPr>
+            <w:r/>
+            <w:r>
+              <w:rPr>
+                <w:rFonts w:ascii="Aptos" w:hAnsi="Aptos"/>
+                <w:b/>
+                <w:color w:val="2F5597"/>
+                <w:sz w:val="18"/>
+              </w:rPr>
+              <w:t>1</w:t>
+            </w:r>
+          </w:p>
+        </w:tc>
+        <w:tc>
+          <w:tcPr>
+            <w:tcW w:type="dxa" w:w="3816"/>
+            <w:vAlign w:val="center"/>
+            <w:tcMar>
+              <w:top w:w="65" w:type="dxa"/>
+              <w:start w:w="110" w:type="dxa"/>
+              <w:bottom w:w="65" w:type="dxa"/>
+              <w:end w:w="110" w:type="dxa"/>
+            </w:tcMar>
+          </w:tcPr>
+          <w:p>
+            <w:pPr>
+              <w:spacing w:after="0" w:line="252" w:lineRule="auto"/>
+            </w:pPr>
+            <w:r/>
+            <w:r>
+              <w:rPr>
+                <w:rFonts w:ascii="Aptos" w:hAnsi="Aptos"/>
+                <w:b w:val="0"/>
+                <w:sz w:val="18"/>
+              </w:rPr>
+              <w:t>Open the marketing site and choose Start free trial.</w:t>
+            </w:r>
+          </w:p>
+        </w:tc>
+        <w:tc>
+          <w:tcPr>
+            <w:tcW w:type="dxa" w:w="5832"/>
+            <w:vAlign w:val="center"/>
+            <w:tcMar>
+              <w:top w:w="65" w:type="dxa"/>
+              <w:start w:w="110" w:type="dxa"/>
+              <w:bottom w:w="65" w:type="dxa"/>
+              <w:end w:w="110" w:type="dxa"/>
+            </w:tcMar>
+          </w:tcPr>
+          <w:p>
+            <w:pPr>
+              <w:spacing w:after="0" w:line="252" w:lineRule="auto"/>
+            </w:pPr>
+            <w:r/>
+            <w:r>
+              <w:rPr>
+                <w:rFonts w:ascii="Aptos" w:hAnsi="Aptos"/>
+                <w:b w:val="0"/>
+                <w:sz w:val="18"/>
+              </w:rPr>
+              <w:t>The sign-up page opens and clearly explains the trial.</w:t>
+            </w:r>
+          </w:p>
+        </w:tc>
+      </w:tr>
+      <w:tr>
+        <w:trPr>
+          <w:cantSplit/>
+        </w:trPr>
+        <w:tc>
+          <w:tcPr>
+            <w:tcW w:type="dxa" w:w="691"/>
+            <w:vAlign w:val="center"/>
+            <w:tcMar>
+              <w:top w:w="65" w:type="dxa"/>
+              <w:start w:w="110" w:type="dxa"/>
+              <w:bottom w:w="65" w:type="dxa"/>
+              <w:end w:w="110" w:type="dxa"/>
+            </w:tcMar>
+            <w:shd w:fill="EAF2F8"/>
+          </w:tcPr>
+          <w:p>
+            <w:pPr>
+              <w:spacing w:after="0" w:line="252" w:lineRule="auto"/>
+              <w:jc w:val="center"/>
+            </w:pPr>
+            <w:r/>
+            <w:r>
+              <w:rPr>
+                <w:rFonts w:ascii="Aptos" w:hAnsi="Aptos"/>
+                <w:b/>
+                <w:color w:val="2F5597"/>
+                <w:sz w:val="18"/>
+              </w:rPr>
+              <w:t>2</w:t>
+            </w:r>
+          </w:p>
+        </w:tc>
+        <w:tc>
+          <w:tcPr>
+            <w:tcW w:type="dxa" w:w="3816"/>
+            <w:vAlign w:val="center"/>
+            <w:tcMar>
+              <w:top w:w="65" w:type="dxa"/>
+              <w:start w:w="110" w:type="dxa"/>
+              <w:bottom w:w="65" w:type="dxa"/>
+              <w:end w:w="110" w:type="dxa"/>
+            </w:tcMar>
+            <w:shd w:fill="EAF2F8"/>
+          </w:tcPr>
+          <w:p>
+            <w:pPr>
+              <w:spacing w:after="0" w:line="252" w:lineRule="auto"/>
+            </w:pPr>
+            <w:r/>
+            <w:r>
+              <w:rPr>
+                <w:rFonts w:ascii="Aptos" w:hAnsi="Aptos"/>
+                <w:b w:val="0"/>
+                <w:sz w:val="18"/>
+              </w:rPr>
+              <w:t>Register with a new work email and valid password.</w:t>
+            </w:r>
+          </w:p>
+        </w:tc>
+        <w:tc>
+          <w:tcPr>
+            <w:tcW w:type="dxa" w:w="5832"/>
+            <w:vAlign w:val="center"/>
+            <w:tcMar>
+              <w:top w:w="65" w:type="dxa"/>
+              <w:start w:w="110" w:type="dxa"/>
+              <w:bottom w:w="65" w:type="dxa"/>
+              <w:end w:w="110" w:type="dxa"/>
+            </w:tcMar>
+            <w:shd w:fill="EAF2F8"/>
+          </w:tcPr>
+          <w:p>
+            <w:pPr>
+              <w:spacing w:after="0" w:line="252" w:lineRule="auto"/>
+            </w:pPr>
+            <w:r/>
+            <w:r>
+              <w:rPr>
+                <w:rFonts w:ascii="Aptos" w:hAnsi="Aptos"/>
+                <w:b w:val="0"/>
+                <w:sz w:val="18"/>
+              </w:rPr>
+              <w:t>The check-your-email page appears and a verification email is delivered.</w:t>
+            </w:r>
+          </w:p>
+        </w:tc>
+      </w:tr>
+      <w:tr>
+        <w:trPr>
+          <w:cantSplit/>
+        </w:trPr>
+        <w:tc>
+          <w:tcPr>
+            <w:tcW w:type="dxa" w:w="691"/>
+            <w:vAlign w:val="center"/>
+            <w:tcMar>
+              <w:top w:w="65" w:type="dxa"/>
+              <w:start w:w="110" w:type="dxa"/>
+              <w:bottom w:w="65" w:type="dxa"/>
+              <w:end w:w="110" w:type="dxa"/>
+            </w:tcMar>
+          </w:tcPr>
+          <w:p>
+            <w:pPr>
+              <w:spacing w:after="0" w:line="252" w:lineRule="auto"/>
+              <w:jc w:val="center"/>
+            </w:pPr>
+            <w:r/>
+            <w:r>
+              <w:rPr>
+                <w:rFonts w:ascii="Aptos" w:hAnsi="Aptos"/>
+                <w:b/>
+                <w:color w:val="2F5597"/>
+                <w:sz w:val="18"/>
+              </w:rPr>
+              <w:t>3</w:t>
+            </w:r>
+          </w:p>
+        </w:tc>
+        <w:tc>
+          <w:tcPr>
+            <w:tcW w:type="dxa" w:w="3816"/>
+            <w:vAlign w:val="center"/>
+            <w:tcMar>
+              <w:top w:w="65" w:type="dxa"/>
+              <w:start w:w="110" w:type="dxa"/>
+              <w:bottom w:w="65" w:type="dxa"/>
+              <w:end w:w="110" w:type="dxa"/>
+            </w:tcMar>
+          </w:tcPr>
+          <w:p>
+            <w:pPr>
+              <w:spacing w:after="0" w:line="252" w:lineRule="auto"/>
+            </w:pPr>
+            <w:r/>
+            <w:r>
+              <w:rPr>
+                <w:rFonts w:ascii="Aptos" w:hAnsi="Aptos"/>
+                <w:b w:val="0"/>
+                <w:sz w:val="18"/>
+              </w:rPr>
+              <w:t>Use the verification link.</w:t>
+            </w:r>
+          </w:p>
+        </w:tc>
+        <w:tc>
+          <w:tcPr>
+            <w:tcW w:type="dxa" w:w="5832"/>
+            <w:vAlign w:val="center"/>
+            <w:tcMar>
+              <w:top w:w="65" w:type="dxa"/>
+              <w:start w:w="110" w:type="dxa"/>
+              <w:bottom w:w="65" w:type="dxa"/>
+              <w:end w:w="110" w:type="dxa"/>
+            </w:tcMar>
+          </w:tcPr>
+          <w:p>
+            <w:pPr>
+              <w:spacing w:after="0" w:line="252" w:lineRule="auto"/>
+            </w:pPr>
+            <w:r/>
+            <w:r>
+              <w:rPr>
+                <w:rFonts w:ascii="Aptos" w:hAnsi="Aptos"/>
+                <w:b w:val="0"/>
+                <w:sz w:val="18"/>
+              </w:rPr>
+              <w:t>The account is verified and the company creation flow opens.</w:t>
+            </w:r>
+          </w:p>
+        </w:tc>
+      </w:tr>
+      <w:tr>
+        <w:trPr>
+          <w:cantSplit/>
+        </w:trPr>
+        <w:tc>
+          <w:tcPr>
+            <w:tcW w:type="dxa" w:w="691"/>
+            <w:vAlign w:val="center"/>
+            <w:tcMar>
+              <w:top w:w="65" w:type="dxa"/>
+              <w:start w:w="110" w:type="dxa"/>
+              <w:bottom w:w="65" w:type="dxa"/>
+              <w:end w:w="110" w:type="dxa"/>
+            </w:tcMar>
+            <w:shd w:fill="EAF2F8"/>
+          </w:tcPr>
+          <w:p>
+            <w:pPr>
+              <w:spacing w:after="0" w:line="252" w:lineRule="auto"/>
+              <w:jc w:val="center"/>
+            </w:pPr>
+            <w:r/>
+            <w:r>
+              <w:rPr>
+                <w:rFonts w:ascii="Aptos" w:hAnsi="Aptos"/>
+                <w:b/>
+                <w:color w:val="2F5597"/>
+                <w:sz w:val="18"/>
+              </w:rPr>
+              <w:t>4</w:t>
+            </w:r>
+          </w:p>
+        </w:tc>
+        <w:tc>
+          <w:tcPr>
+            <w:tcW w:type="dxa" w:w="3816"/>
+            <w:vAlign w:val="center"/>
+            <w:tcMar>
+              <w:top w:w="65" w:type="dxa"/>
+              <w:start w:w="110" w:type="dxa"/>
+              <w:bottom w:w="65" w:type="dxa"/>
+              <w:end w:w="110" w:type="dxa"/>
+            </w:tcMar>
+            <w:shd w:fill="EAF2F8"/>
+          </w:tcPr>
+          <w:p>
+            <w:pPr>
+              <w:spacing w:after="0" w:line="252" w:lineRule="auto"/>
+            </w:pPr>
+            <w:r/>
+            <w:r>
+              <w:rPr>
+                <w:rFonts w:ascii="Aptos" w:hAnsi="Aptos"/>
+                <w:b w:val="0"/>
+                <w:sz w:val="18"/>
+              </w:rPr>
+              <w:t>Create the company with its name, locale and time zone.</w:t>
+            </w:r>
+          </w:p>
+        </w:tc>
+        <w:tc>
+          <w:tcPr>
+            <w:tcW w:type="dxa" w:w="5832"/>
+            <w:vAlign w:val="center"/>
+            <w:tcMar>
+              <w:top w:w="65" w:type="dxa"/>
+              <w:start w:w="110" w:type="dxa"/>
+              <w:bottom w:w="65" w:type="dxa"/>
+              <w:end w:w="110" w:type="dxa"/>
+            </w:tcMar>
+            <w:shd w:fill="EAF2F8"/>
+          </w:tcPr>
+          <w:p>
+            <w:pPr>
+              <w:spacing w:after="0" w:line="252" w:lineRule="auto"/>
+            </w:pPr>
+            <w:r/>
+            <w:r>
+              <w:rPr>
+                <w:rFonts w:ascii="Aptos" w:hAnsi="Aptos"/>
+                <w:b w:val="0"/>
+                <w:sz w:val="18"/>
+              </w:rPr>
+              <w:t>The company is created and the Getting Started page opens.</w:t>
+            </w:r>
+          </w:p>
+        </w:tc>
+      </w:tr>
+      <w:tr>
+        <w:trPr>
+          <w:cantSplit/>
+        </w:trPr>
+        <w:tc>
+          <w:tcPr>
+            <w:tcW w:type="dxa" w:w="691"/>
+            <w:vAlign w:val="center"/>
+            <w:tcMar>
+              <w:top w:w="65" w:type="dxa"/>
+              <w:start w:w="110" w:type="dxa"/>
+              <w:bottom w:w="65" w:type="dxa"/>
+              <w:end w:w="110" w:type="dxa"/>
+            </w:tcMar>
+          </w:tcPr>
+          <w:p>
+            <w:pPr>
+              <w:spacing w:after="0" w:line="252" w:lineRule="auto"/>
+              <w:jc w:val="center"/>
+            </w:pPr>
+            <w:r/>
+            <w:r>
+              <w:rPr>
+                <w:rFonts w:ascii="Aptos" w:hAnsi="Aptos"/>
+                <w:b/>
+                <w:color w:val="2F5597"/>
+                <w:sz w:val="18"/>
+              </w:rPr>
+              <w:t>5</w:t>
+            </w:r>
+          </w:p>
+        </w:tc>
+        <w:tc>
+          <w:tcPr>
+            <w:tcW w:type="dxa" w:w="3816"/>
+            <w:vAlign w:val="center"/>
+            <w:tcMar>
+              <w:top w:w="65" w:type="dxa"/>
+              <w:start w:w="110" w:type="dxa"/>
+              <w:bottom w:w="65" w:type="dxa"/>
+              <w:end w:w="110" w:type="dxa"/>
+            </w:tcMar>
+          </w:tcPr>
+          <w:p>
+            <w:pPr>
+              <w:spacing w:after="0" w:line="252" w:lineRule="auto"/>
+            </w:pPr>
+            <w:r/>
+            <w:r>
+              <w:rPr>
+                <w:rFonts w:ascii="Aptos" w:hAnsi="Aptos"/>
+                <w:b w:val="0"/>
+                <w:sz w:val="18"/>
+              </w:rPr>
+              <w:t>Review the initial setup links and trial banner.</w:t>
+            </w:r>
+          </w:p>
+        </w:tc>
+        <w:tc>
+          <w:tcPr>
+            <w:tcW w:type="dxa" w:w="5832"/>
+            <w:vAlign w:val="center"/>
+            <w:tcMar>
+              <w:top w:w="65" w:type="dxa"/>
+              <w:start w:w="110" w:type="dxa"/>
+              <w:bottom w:w="65" w:type="dxa"/>
+              <w:end w:w="110" w:type="dxa"/>
+            </w:tcMar>
+          </w:tcPr>
+          <w:p>
+            <w:pPr>
+              <w:spacing w:after="0" w:line="252" w:lineRule="auto"/>
+            </w:pPr>
+            <w:r/>
+            <w:r>
+              <w:rPr>
+                <w:rFonts w:ascii="Aptos" w:hAnsi="Aptos"/>
+                <w:b w:val="0"/>
+                <w:sz w:val="18"/>
+              </w:rPr>
+              <w:t>The trial is active and each setup link opens the stated area.</w:t>
+            </w:r>
+          </w:p>
+        </w:tc>
+      </w:tr>
+      <w:tr>
+        <w:trPr>
+          <w:cantSplit/>
+        </w:trPr>
+        <w:tc>
+          <w:tcPr>
+            <w:tcW w:type="dxa" w:w="691"/>
+            <w:vAlign w:val="center"/>
+            <w:tcMar>
+              <w:top w:w="65" w:type="dxa"/>
+              <w:start w:w="110" w:type="dxa"/>
+              <w:bottom w:w="65" w:type="dxa"/>
+              <w:end w:w="110" w:type="dxa"/>
+            </w:tcMar>
+            <w:shd w:fill="EAF2F8"/>
+          </w:tcPr>
+          <w:p>
+            <w:pPr>
+              <w:spacing w:after="0" w:line="252" w:lineRule="auto"/>
+              <w:jc w:val="center"/>
+            </w:pPr>
+            <w:r/>
+            <w:r>
+              <w:rPr>
+                <w:rFonts w:ascii="Aptos" w:hAnsi="Aptos"/>
+                <w:b/>
+                <w:color w:val="2F5597"/>
+                <w:sz w:val="18"/>
+              </w:rPr>
+              <w:t>6</w:t>
+            </w:r>
+          </w:p>
+        </w:tc>
+        <w:tc>
+          <w:tcPr>
+            <w:tcW w:type="dxa" w:w="3816"/>
+            <w:vAlign w:val="center"/>
+            <w:tcMar>
+              <w:top w:w="65" w:type="dxa"/>
+              <w:start w:w="110" w:type="dxa"/>
+              <w:bottom w:w="65" w:type="dxa"/>
+              <w:end w:w="110" w:type="dxa"/>
+            </w:tcMar>
+            <w:shd w:fill="EAF2F8"/>
+          </w:tcPr>
+          <w:p>
+            <w:pPr>
+              <w:spacing w:after="0" w:line="252" w:lineRule="auto"/>
+            </w:pPr>
+            <w:r/>
+            <w:r>
+              <w:rPr>
+                <w:rFonts w:ascii="Aptos" w:hAnsi="Aptos"/>
+                <w:b w:val="0"/>
+                <w:sz w:val="18"/>
+              </w:rPr>
+              <w:t>Sign out and sign in again.</w:t>
+            </w:r>
+          </w:p>
+        </w:tc>
+        <w:tc>
+          <w:tcPr>
+            <w:tcW w:type="dxa" w:w="5832"/>
+            <w:vAlign w:val="center"/>
+            <w:tcMar>
+              <w:top w:w="65" w:type="dxa"/>
+              <w:start w:w="110" w:type="dxa"/>
+              <w:bottom w:w="65" w:type="dxa"/>
+              <w:end w:w="110" w:type="dxa"/>
+            </w:tcMar>
+            <w:shd w:fill="EAF2F8"/>
+          </w:tcPr>
+          <w:p>
+            <w:pPr>
+              <w:spacing w:after="0" w:line="252" w:lineRule="auto"/>
+            </w:pPr>
+            <w:r/>
+            <w:r>
+              <w:rPr>
+                <w:rFonts w:ascii="Aptos" w:hAnsi="Aptos"/>
+                <w:b w:val="0"/>
+                <w:sz w:val="18"/>
+              </w:rPr>
+              <w:t>The creator returns to the same company with the expected administration options.</w:t>
+            </w:r>
+          </w:p>
+        </w:tc>
+      </w:tr>
+    </w:tbl>
+    <w:p/>
+    <w:p>
+      <w:pPr>
+        <w:pStyle w:val="Heading2"/>
+      </w:pPr>
+      <w:r>
+        <w:t>Completion checks</w:t>
+      </w:r>
+    </w:p>
+    <w:p>
+      <w:pPr>
+        <w:pStyle w:val="ListBullet"/>
+      </w:pPr>
+      <w:r>
+        <w:t>Record a defect only if this successful journey cannot be completed or its final business outcome is incorrect.</w:t>
       </w:r>
     </w:p>
     <w:p>
@@ -15,497 +938,275 @@
         <w:pStyle w:val="Heading2"/>
       </w:pPr>
       <w:r>
-        <w:t>Customer Story</w:t>
-      </w:r>
-    </w:p>
-    <w:p>
-      <w:r>
-        <w:t>Sarah is the HR Manager at Acme Engineering, a business with 25 employees. The company has decided to evaluate One Big Team. This review is not about finding software bugs—it is about deciding whether the product is good enough to buy.</w:t>
-      </w:r>
-    </w:p>
-    <w:p>
-      <w:pPr>
-        <w:pStyle w:val="Heading2"/>
-      </w:pPr>
-      <w:r>
-        <w:t>Objective</w:t>
-      </w:r>
-    </w:p>
-    <w:p>
-      <w:r>
-        <w:t>Walk through the journey exactly as a real customer would. At every stage, stop and ask whether the experience builds confidence or creates uncertainty.</w:t>
-      </w:r>
-    </w:p>
-    <w:p>
-      <w:pPr>
-        <w:pStyle w:val="Heading2"/>
-      </w:pPr>
-      <w:r>
-        <w:t>Journey</w:t>
-      </w:r>
-    </w:p>
-    <w:p>
-      <w:pPr>
-        <w:pStyle w:val="Heading3"/>
-      </w:pPr>
-      <w:r>
-        <w:t>Stage 1</w:t>
-      </w:r>
-    </w:p>
-    <w:p>
-      <w:r>
-        <w:t>Visit the marketing site and click Start Free Trial.</w:t>
-      </w:r>
-    </w:p>
-    <w:p>
-      <w:pPr>
-        <w:pStyle w:val="ListBullet"/>
-      </w:pPr>
-      <w:r>
-        <w:t>Expectation: Before clicking anything, what would you expect to happen next?</w:t>
-      </w:r>
-    </w:p>
-    <w:p>
-      <w:pPr>
-        <w:pStyle w:val="ListBullet"/>
-      </w:pPr>
-      <w:r>
-        <w:t>Action: Complete the next step in the onboarding journey using only the information on screen.</w:t>
-      </w:r>
-    </w:p>
-    <w:p>
-      <w:pPr>
-        <w:pStyle w:val="ListBullet"/>
-      </w:pPr>
-      <w:r>
-        <w:t>Reaction: Did One Big Team behave exactly as you expected? If not, why not?</w:t>
-      </w:r>
-    </w:p>
-    <w:p>
-      <w:pPr>
-        <w:pStyle w:val="ListBullet"/>
-      </w:pPr>
-      <w:r>
-        <w:t>Reflection: If you were demonstrating this to your CEO tomorrow, would you be comfortable?</w:t>
-      </w:r>
-    </w:p>
-    <w:p>
-      <w:pPr>
-        <w:pStyle w:val="IntenseQuote"/>
-      </w:pPr>
-      <w:r>
-        <w:t>Create a product ticket immediately if you discover anything that could make this experience simpler.</w:t>
-      </w:r>
-    </w:p>
-    <w:p>
-      <w:pPr>
-        <w:pStyle w:val="Heading3"/>
-      </w:pPr>
-      <w:r>
-        <w:t>Stage 2</w:t>
-      </w:r>
-    </w:p>
-    <w:p>
-      <w:r>
-        <w:t>Register and verify your email.</w:t>
-      </w:r>
-    </w:p>
-    <w:p>
-      <w:pPr>
-        <w:pStyle w:val="ListBullet"/>
-      </w:pPr>
-      <w:r>
-        <w:t>Expectation: Before clicking anything, what would you expect to happen next?</w:t>
-      </w:r>
-    </w:p>
-    <w:p>
-      <w:pPr>
-        <w:pStyle w:val="ListBullet"/>
-      </w:pPr>
-      <w:r>
-        <w:t>Action: Complete the next step in the onboarding journey using only the information on screen.</w:t>
-      </w:r>
-    </w:p>
-    <w:p>
-      <w:pPr>
-        <w:pStyle w:val="ListBullet"/>
-      </w:pPr>
-      <w:r>
-        <w:t>Reaction: Did One Big Team behave exactly as you expected? If not, why not?</w:t>
-      </w:r>
-    </w:p>
-    <w:p>
-      <w:pPr>
-        <w:pStyle w:val="ListBullet"/>
-      </w:pPr>
-      <w:r>
-        <w:t>Reflection: If you were demonstrating this to your CEO tomorrow, would you be comfortable?</w:t>
-      </w:r>
-    </w:p>
-    <w:p>
-      <w:pPr>
-        <w:pStyle w:val="IntenseQuote"/>
-      </w:pPr>
-      <w:r>
-        <w:t>Create a product ticket immediately if you discover anything that could make this experience simpler.</w:t>
-      </w:r>
-    </w:p>
-    <w:p>
-      <w:pPr>
-        <w:pStyle w:val="Heading3"/>
-      </w:pPr>
-      <w:r>
-        <w:t>Stage 3</w:t>
-      </w:r>
-    </w:p>
-    <w:p>
-      <w:r>
-        <w:t>Create the company using only essential information.</w:t>
-      </w:r>
-    </w:p>
-    <w:p>
-      <w:pPr>
-        <w:pStyle w:val="ListBullet"/>
-      </w:pPr>
-      <w:r>
-        <w:t>Expectation: Before clicking anything, what would you expect to happen next?</w:t>
-      </w:r>
-    </w:p>
-    <w:p>
-      <w:pPr>
-        <w:pStyle w:val="ListBullet"/>
-      </w:pPr>
-      <w:r>
-        <w:t>Action: Complete the next step in the onboarding journey using only the information on screen.</w:t>
-      </w:r>
-    </w:p>
-    <w:p>
-      <w:pPr>
-        <w:pStyle w:val="ListBullet"/>
-      </w:pPr>
-      <w:r>
-        <w:t>Reaction: Did One Big Team behave exactly as you expected? If not, why not?</w:t>
-      </w:r>
-    </w:p>
-    <w:p>
-      <w:pPr>
-        <w:pStyle w:val="ListBullet"/>
-      </w:pPr>
-      <w:r>
-        <w:t>Reflection: If you were demonstrating this to your CEO tomorrow, would you be comfortable?</w:t>
-      </w:r>
-    </w:p>
-    <w:p>
-      <w:pPr>
-        <w:pStyle w:val="IntenseQuote"/>
-      </w:pPr>
-      <w:r>
-        <w:t>Create a product ticket immediately if you discover anything that could make this experience simpler.</w:t>
-      </w:r>
-    </w:p>
-    <w:p>
-      <w:pPr>
-        <w:pStyle w:val="Heading3"/>
-      </w:pPr>
-      <w:r>
-        <w:t>Stage 4</w:t>
-      </w:r>
-    </w:p>
-    <w:p>
-      <w:r>
-        <w:t>Arrive on Getting Started and review the suggested tasks.</w:t>
-      </w:r>
-    </w:p>
-    <w:p>
-      <w:pPr>
-        <w:pStyle w:val="ListBullet"/>
-      </w:pPr>
-      <w:r>
-        <w:t>Expectation: Before clicking anything, what would you expect to happen next?</w:t>
-      </w:r>
-    </w:p>
-    <w:p>
-      <w:pPr>
-        <w:pStyle w:val="ListBullet"/>
-      </w:pPr>
-      <w:r>
-        <w:t>Action: Complete the next step in the onboarding journey using only the information on screen.</w:t>
-      </w:r>
-    </w:p>
-    <w:p>
-      <w:pPr>
-        <w:pStyle w:val="ListBullet"/>
-      </w:pPr>
-      <w:r>
-        <w:t>Reaction: Did One Big Team behave exactly as you expected? If not, why not?</w:t>
-      </w:r>
-    </w:p>
-    <w:p>
-      <w:pPr>
-        <w:pStyle w:val="ListBullet"/>
-      </w:pPr>
-      <w:r>
-        <w:t>Reflection: If you were demonstrating this to your CEO tomorrow, would you be comfortable?</w:t>
-      </w:r>
-    </w:p>
-    <w:p>
-      <w:pPr>
-        <w:pStyle w:val="IntenseQuote"/>
-      </w:pPr>
-      <w:r>
-        <w:t>Create a product ticket immediately if you discover anything that could make this experience simpler.</w:t>
-      </w:r>
-    </w:p>
-    <w:p>
-      <w:pPr>
-        <w:pStyle w:val="Heading3"/>
-      </w:pPr>
-      <w:r>
-        <w:t>Stage 5</w:t>
-      </w:r>
-    </w:p>
-    <w:p>
-      <w:r>
-        <w:t>Notice the default leave policy has already been created.</w:t>
-      </w:r>
-    </w:p>
-    <w:p>
-      <w:pPr>
-        <w:pStyle w:val="ListBullet"/>
-      </w:pPr>
-      <w:r>
-        <w:t>Expectation: Before clicking anything, what would you expect to happen next?</w:t>
-      </w:r>
-    </w:p>
-    <w:p>
-      <w:pPr>
-        <w:pStyle w:val="ListBullet"/>
-      </w:pPr>
-      <w:r>
-        <w:t>Action: Complete the next step in the onboarding journey using only the information on screen.</w:t>
-      </w:r>
-    </w:p>
-    <w:p>
-      <w:pPr>
-        <w:pStyle w:val="ListBullet"/>
-      </w:pPr>
-      <w:r>
-        <w:t>Reaction: Did One Big Team behave exactly as you expected? If not, why not?</w:t>
-      </w:r>
-    </w:p>
-    <w:p>
-      <w:pPr>
-        <w:pStyle w:val="ListBullet"/>
-      </w:pPr>
-      <w:r>
-        <w:t>Reflection: If you were demonstrating this to your CEO tomorrow, would you be comfortable?</w:t>
-      </w:r>
-    </w:p>
-    <w:p>
-      <w:pPr>
-        <w:pStyle w:val="IntenseQuote"/>
-      </w:pPr>
-      <w:r>
-        <w:t>Create a product ticket immediately if you discover anything that could make this experience simpler.</w:t>
-      </w:r>
-    </w:p>
-    <w:p>
-      <w:pPr>
-        <w:pStyle w:val="Heading3"/>
-      </w:pPr>
-      <w:r>
-        <w:t>Stage 6</w:t>
-      </w:r>
-    </w:p>
-    <w:p>
-      <w:r>
-        <w:t>Decide whether to import employees now or later.</w:t>
-      </w:r>
-    </w:p>
-    <w:p>
-      <w:pPr>
-        <w:pStyle w:val="ListBullet"/>
-      </w:pPr>
-      <w:r>
-        <w:t>Expectation: Before clicking anything, what would you expect to happen next?</w:t>
-      </w:r>
-    </w:p>
-    <w:p>
-      <w:pPr>
-        <w:pStyle w:val="ListBullet"/>
-      </w:pPr>
-      <w:r>
-        <w:t>Action: Complete the next step in the onboarding journey using only the information on screen.</w:t>
-      </w:r>
-    </w:p>
-    <w:p>
-      <w:pPr>
-        <w:pStyle w:val="ListBullet"/>
-      </w:pPr>
-      <w:r>
-        <w:t>Reaction: Did One Big Team behave exactly as you expected? If not, why not?</w:t>
-      </w:r>
-    </w:p>
-    <w:p>
-      <w:pPr>
-        <w:pStyle w:val="ListBullet"/>
-      </w:pPr>
-      <w:r>
-        <w:t>Reflection: If you were demonstrating this to your CEO tomorrow, would you be comfortable?</w:t>
-      </w:r>
-    </w:p>
-    <w:p>
-      <w:pPr>
-        <w:pStyle w:val="IntenseQuote"/>
-      </w:pPr>
-      <w:r>
-        <w:t>Create a product ticket immediately if you discover anything that could make this experience simpler.</w:t>
-      </w:r>
-    </w:p>
-    <w:p>
-      <w:pPr>
-        <w:pStyle w:val="Heading2"/>
-      </w:pPr>
-      <w:r>
-        <w:t>Final Review</w:t>
-      </w:r>
-    </w:p>
-    <w:p>
-      <w:r>
-        <w:t>Answer these before moving on:</w:t>
+        <w:t>Execution record</w:t>
       </w:r>
     </w:p>
     <w:tbl>
       <w:tblPr>
-        <w:tblStyle w:val="TableGrid"/>
         <w:tblW w:type="auto" w:w="0"/>
+        <w:jc w:val="center"/>
+        <w:tblLayout w:type="fixed"/>
         <w:tblLook w:firstColumn="1" w:firstRow="1" w:lastColumn="0" w:lastRow="0" w:noHBand="0" w:noVBand="1" w:val="04A0"/>
       </w:tblPr>
       <w:tblGrid>
-        <w:gridCol w:w="4320"/>
-        <w:gridCol w:w="4320"/>
+        <w:gridCol w:w="2592"/>
+        <w:gridCol w:w="2592"/>
+        <w:gridCol w:w="2592"/>
+        <w:gridCol w:w="2592"/>
       </w:tblGrid>
       <w:tr>
+        <w:trPr>
+          <w:cantSplit/>
+        </w:trPr>
         <w:tc>
           <w:tcPr>
-            <w:tcW w:type="dxa" w:w="4320"/>
+            <w:tcW w:type="dxa" w:w="1800"/>
+            <w:vAlign w:val="center"/>
+            <w:tcMar>
+              <w:top w:w="65" w:type="dxa"/>
+              <w:start w:w="110" w:type="dxa"/>
+              <w:bottom w:w="65" w:type="dxa"/>
+              <w:end w:w="110" w:type="dxa"/>
+            </w:tcMar>
+            <w:shd w:fill="2F5597"/>
           </w:tcPr>
           <w:p>
+            <w:pPr>
+              <w:spacing w:after="0" w:line="252" w:lineRule="auto"/>
+            </w:pPr>
+            <w:r/>
             <w:r>
-              <w:t>Question</w:t>
+              <w:rPr>
+                <w:rFonts w:ascii="Aptos" w:hAnsi="Aptos"/>
+                <w:b/>
+                <w:color w:val="FFFFFF"/>
+                <w:sz w:val="18"/>
+              </w:rPr>
+              <w:t>Overall result</w:t>
             </w:r>
           </w:p>
         </w:tc>
         <w:tc>
           <w:tcPr>
-            <w:tcW w:type="dxa" w:w="4320"/>
+            <w:tcW w:type="dxa" w:w="3240"/>
+            <w:vAlign w:val="center"/>
+            <w:tcMar>
+              <w:top w:w="65" w:type="dxa"/>
+              <w:start w:w="110" w:type="dxa"/>
+              <w:bottom w:w="65" w:type="dxa"/>
+              <w:end w:w="110" w:type="dxa"/>
+            </w:tcMar>
           </w:tcPr>
           <w:p>
+            <w:pPr>
+              <w:spacing w:after="0" w:line="252" w:lineRule="auto"/>
+            </w:pPr>
+            <w:r/>
             <w:r>
-              <w:t>Response</w:t>
+              <w:rPr>
+                <w:rFonts w:ascii="Aptos" w:hAnsi="Aptos"/>
+                <w:b w:val="0"/>
+                <w:sz w:val="18"/>
+              </w:rPr>
+              <w:t>Pass / Fail / Blocked</w:t>
+            </w:r>
+          </w:p>
+        </w:tc>
+        <w:tc>
+          <w:tcPr>
+            <w:tcW w:type="dxa" w:w="1800"/>
+            <w:vAlign w:val="center"/>
+            <w:tcMar>
+              <w:top w:w="65" w:type="dxa"/>
+              <w:start w:w="110" w:type="dxa"/>
+              <w:bottom w:w="65" w:type="dxa"/>
+              <w:end w:w="110" w:type="dxa"/>
+            </w:tcMar>
+            <w:shd w:fill="2F5597"/>
+          </w:tcPr>
+          <w:p>
+            <w:pPr>
+              <w:spacing w:after="0" w:line="252" w:lineRule="auto"/>
+            </w:pPr>
+            <w:r/>
+            <w:r>
+              <w:rPr>
+                <w:rFonts w:ascii="Aptos" w:hAnsi="Aptos"/>
+                <w:b/>
+                <w:color w:val="FFFFFF"/>
+                <w:sz w:val="18"/>
+              </w:rPr>
+              <w:t>Tester</w:t>
+            </w:r>
+          </w:p>
+        </w:tc>
+        <w:tc>
+          <w:tcPr>
+            <w:tcW w:type="dxa" w:w="3384"/>
+            <w:vAlign w:val="center"/>
+            <w:tcMar>
+              <w:top w:w="65" w:type="dxa"/>
+              <w:start w:w="110" w:type="dxa"/>
+              <w:bottom w:w="65" w:type="dxa"/>
+              <w:end w:w="110" w:type="dxa"/>
+            </w:tcMar>
+          </w:tcPr>
+          <w:p>
+            <w:pPr>
+              <w:spacing w:after="0" w:line="252" w:lineRule="auto"/>
+            </w:pPr>
+            <w:r/>
+            <w:r>
+              <w:rPr>
+                <w:rFonts w:ascii="Aptos" w:hAnsi="Aptos"/>
+                <w:b w:val="0"/>
+                <w:sz w:val="18"/>
+              </w:rPr>
             </w:r>
           </w:p>
         </w:tc>
       </w:tr>
       <w:tr>
+        <w:trPr>
+          <w:cantSplit/>
+        </w:trPr>
         <w:tc>
           <w:tcPr>
-            <w:tcW w:type="dxa" w:w="4320"/>
+            <w:tcW w:type="dxa" w:w="1800"/>
+            <w:vAlign w:val="center"/>
+            <w:tcMar>
+              <w:top w:w="65" w:type="dxa"/>
+              <w:start w:w="110" w:type="dxa"/>
+              <w:bottom w:w="65" w:type="dxa"/>
+              <w:end w:w="110" w:type="dxa"/>
+            </w:tcMar>
+            <w:shd w:fill="2F5597"/>
           </w:tcPr>
           <w:p>
+            <w:pPr>
+              <w:spacing w:after="0" w:line="252" w:lineRule="auto"/>
+            </w:pPr>
+            <w:r/>
             <w:r>
-              <w:t>Would I buy after this journey?</w:t>
+              <w:rPr>
+                <w:rFonts w:ascii="Aptos" w:hAnsi="Aptos"/>
+                <w:b/>
+                <w:color w:val="FFFFFF"/>
+                <w:sz w:val="18"/>
+              </w:rPr>
+              <w:t>Execution date</w:t>
             </w:r>
           </w:p>
         </w:tc>
         <w:tc>
           <w:tcPr>
-            <w:tcW w:type="dxa" w:w="4320"/>
-          </w:tcPr>
-          <w:p/>
-        </w:tc>
-      </w:tr>
-      <w:tr>
-        <w:tc>
-          <w:tcPr>
-            <w:tcW w:type="dxa" w:w="4320"/>
+            <w:tcW w:type="dxa" w:w="3240"/>
+            <w:vAlign w:val="center"/>
+            <w:tcMar>
+              <w:top w:w="65" w:type="dxa"/>
+              <w:start w:w="110" w:type="dxa"/>
+              <w:bottom w:w="65" w:type="dxa"/>
+              <w:end w:w="110" w:type="dxa"/>
+            </w:tcMar>
           </w:tcPr>
           <w:p>
+            <w:pPr>
+              <w:spacing w:after="0" w:line="252" w:lineRule="auto"/>
+            </w:pPr>
+            <w:r/>
             <w:r>
-              <w:t>Where did I hesitate?</w:t>
+              <w:rPr>
+                <w:rFonts w:ascii="Aptos" w:hAnsi="Aptos"/>
+                <w:b w:val="0"/>
+                <w:sz w:val="18"/>
+              </w:rPr>
             </w:r>
           </w:p>
         </w:tc>
         <w:tc>
           <w:tcPr>
-            <w:tcW w:type="dxa" w:w="4320"/>
-          </w:tcPr>
-          <w:p/>
-        </w:tc>
-      </w:tr>
-      <w:tr>
-        <w:tc>
-          <w:tcPr>
-            <w:tcW w:type="dxa" w:w="4320"/>
+            <w:tcW w:type="dxa" w:w="1800"/>
+            <w:vAlign w:val="center"/>
+            <w:tcMar>
+              <w:top w:w="65" w:type="dxa"/>
+              <w:start w:w="110" w:type="dxa"/>
+              <w:bottom w:w="65" w:type="dxa"/>
+              <w:end w:w="110" w:type="dxa"/>
+            </w:tcMar>
+            <w:shd w:fill="2F5597"/>
           </w:tcPr>
           <w:p>
+            <w:pPr>
+              <w:spacing w:after="0" w:line="252" w:lineRule="auto"/>
+            </w:pPr>
+            <w:r/>
             <w:r>
-              <w:t>What delighted me?</w:t>
+              <w:rPr>
+                <w:rFonts w:ascii="Aptos" w:hAnsi="Aptos"/>
+                <w:b/>
+                <w:color w:val="FFFFFF"/>
+                <w:sz w:val="18"/>
+              </w:rPr>
+              <w:t>Evidence / defect links</w:t>
             </w:r>
           </w:p>
         </w:tc>
         <w:tc>
           <w:tcPr>
-            <w:tcW w:type="dxa" w:w="4320"/>
-          </w:tcPr>
-          <w:p/>
-        </w:tc>
-      </w:tr>
-      <w:tr>
-        <w:tc>
-          <w:tcPr>
-            <w:tcW w:type="dxa" w:w="4320"/>
+            <w:tcW w:type="dxa" w:w="3384"/>
+            <w:vAlign w:val="center"/>
+            <w:tcMar>
+              <w:top w:w="65" w:type="dxa"/>
+              <w:start w:w="110" w:type="dxa"/>
+              <w:bottom w:w="65" w:type="dxa"/>
+              <w:end w:w="110" w:type="dxa"/>
+            </w:tcMar>
           </w:tcPr>
           <w:p>
+            <w:pPr>
+              <w:spacing w:after="0" w:line="252" w:lineRule="auto"/>
+            </w:pPr>
+            <w:r/>
             <w:r>
-              <w:t>What feature would I build next?</w:t>
+              <w:rPr>
+                <w:rFonts w:ascii="Aptos" w:hAnsi="Aptos"/>
+                <w:b w:val="0"/>
+                <w:sz w:val="18"/>
+              </w:rPr>
             </w:r>
           </w:p>
-        </w:tc>
-        <w:tc>
-          <w:tcPr>
-            <w:tcW w:type="dxa" w:w="4320"/>
-          </w:tcPr>
-          <w:p/>
-        </w:tc>
-      </w:tr>
-      <w:tr>
-        <w:tc>
-          <w:tcPr>
-            <w:tcW w:type="dxa" w:w="4320"/>
-          </w:tcPr>
-          <w:p>
-            <w:r>
-              <w:t>Release decision (Ready / Minor changes / Major changes)</w:t>
-            </w:r>
-          </w:p>
-        </w:tc>
-        <w:tc>
-          <w:tcPr>
-            <w:tcW w:type="dxa" w:w="4320"/>
-          </w:tcPr>
-          <w:p/>
         </w:tc>
       </w:tr>
     </w:tbl>
     <w:sectPr>
+      <w:footerReference w:type="default" r:id="rId9"/>
       <w:pgSz w:w="12240" w:h="15840"/>
-      <w:pgMar w:top="1440" w:right="1800" w:bottom="1440" w:left="1800" w:header="720" w:footer="720" w:gutter="0"/>
+      <w:pgMar w:top="792" w:right="936" w:bottom="720" w:left="936" w:header="360" w:footer="360" w:gutter="0"/>
       <w:cols w:space="720"/>
       <w:docGrid w:linePitch="360"/>
     </w:sectPr>
   </w:body>
 </w:document>
+</file>
+
+<file path=word/footer1.xml><?xml version="1.0" encoding="utf-8"?>
+<w:ftr xmlns:m="http://schemas.openxmlformats.org/officeDocument/2006/math" xmlns:mc="http://schemas.openxmlformats.org/markup-compatibility/2006" xmlns:mo="http://schemas.microsoft.com/office/mac/office/2008/main" xmlns:mv="urn:schemas-microsoft-com:mac:vml" xmlns:o="urn:schemas-microsoft-com:office:office" xmlns:r="http://schemas.openxmlformats.org/officeDocument/2006/relationships" xmlns:v="urn:schemas-microsoft-com:vml" xmlns:w10="urn:schemas-microsoft-com:office:word" xmlns:w14="http://schemas.microsoft.com/office/word/2010/wordml" xmlns:w="http://schemas.openxmlformats.org/wordprocessingml/2006/main" xmlns:wne="http://schemas.microsoft.com/office/word/2006/wordml" xmlns:wp14="http://schemas.microsoft.com/office/word/2010/wordprocessingDrawing" xmlns:wp="http://schemas.openxmlformats.org/drawingml/2006/wordprocessingDrawing" xmlns:wpc="http://schemas.microsoft.com/office/word/2010/wordprocessingCanvas" xmlns:wpg="http://schemas.microsoft.com/office/word/2010/wordprocessingGroup" xmlns:wpi="http://schemas.microsoft.com/office/word/2010/wordprocessingInk" xmlns:wps="http://schemas.microsoft.com/office/word/2010/wordprocessingShape" mc:Ignorable="w14 wp14">
+  <w:p>
+    <w:pPr>
+      <w:pStyle w:val="Footer"/>
+      <w:jc w:val="center"/>
+    </w:pPr>
+    <w:r>
+      <w:rPr>
+        <w:rFonts w:ascii="Aptos" w:hAnsi="Aptos"/>
+        <w:color w:val="64748B"/>
+        <w:sz w:val="16"/>
+      </w:rPr>
+      <w:t xml:space="preserve">OneBigTeam user journey | UJ001 | Updated 27 September 2026 | </w:t>
+    </w:r>
+    <w:fldSimple w:instr="PAGE"/>
+  </w:p>
+</w:ftr>
 </file>
 
 <file path=word/numbering.xml><?xml version="1.0" encoding="utf-8"?>
@@ -871,9 +1572,13 @@
     <w:name w:val="Normal"/>
     <w:qFormat/>
     <w:rsid w:val="00FC693F"/>
+    <w:pPr>
+      <w:spacing w:after="80" w:line="250" w:lineRule="auto"/>
+    </w:pPr>
     <w:rPr>
-      <w:rFonts w:ascii="Calibri" w:hAnsi="Calibri"/>
-      <w:sz w:val="22"/>
+      <w:rFonts w:ascii="Aptos" w:hAnsi="Aptos"/>
+      <w:color w:val="1F2937"/>
+      <w:sz w:val="19"/>
     </w:rPr>
   </w:style>
   <w:style w:type="paragraph" w:styleId="Header">
@@ -931,15 +1636,15 @@
     <w:pPr>
       <w:keepNext/>
       <w:keepLines/>
-      <w:spacing w:before="480" w:after="0"/>
+      <w:spacing w:before="160" w:after="100"/>
       <w:outlineLvl w:val="0"/>
     </w:pPr>
     <w:rPr>
-      <w:rFonts w:asciiTheme="majorHAnsi" w:eastAsiaTheme="majorEastAsia" w:hAnsiTheme="majorHAnsi" w:cstheme="majorBidi"/>
+      <w:rFonts w:asciiTheme="majorHAnsi" w:eastAsiaTheme="majorEastAsia" w:hAnsiTheme="majorHAnsi" w:cstheme="majorBidi" w:ascii="Aptos" w:hAnsi="Aptos"/>
       <w:b/>
       <w:bCs/>
-      <w:color w:val="365F91" w:themeColor="accent1" w:themeShade="BF"/>
-      <w:sz w:val="28"/>
+      <w:color w:val="17365D"/>
+      <w:sz w:val="30"/>
       <w:szCs w:val="28"/>
     </w:rPr>
   </w:style>
@@ -955,15 +1660,15 @@
     <w:pPr>
       <w:keepNext/>
       <w:keepLines/>
-      <w:spacing w:before="200" w:after="0"/>
+      <w:spacing w:before="160" w:after="100"/>
       <w:outlineLvl w:val="1"/>
     </w:pPr>
     <w:rPr>
-      <w:rFonts w:asciiTheme="majorHAnsi" w:eastAsiaTheme="majorEastAsia" w:hAnsiTheme="majorHAnsi" w:cstheme="majorBidi"/>
+      <w:rFonts w:asciiTheme="majorHAnsi" w:eastAsiaTheme="majorEastAsia" w:hAnsiTheme="majorHAnsi" w:cstheme="majorBidi" w:ascii="Aptos" w:hAnsi="Aptos"/>
       <w:b/>
       <w:bCs/>
-      <w:color w:val="4F81BD" w:themeColor="accent1"/>
-      <w:sz w:val="26"/>
+      <w:color w:val="2F5597"/>
+      <w:sz w:val="23"/>
       <w:szCs w:val="26"/>
     </w:rPr>
   </w:style>
@@ -1220,15 +1925,16 @@
       <w:pBdr>
         <w:bottom w:val="single" w:sz="8" w:space="4" w:color="4F81BD" w:themeColor="accent1"/>
       </w:pBdr>
-      <w:spacing w:after="300" w:line="240" w:lineRule="auto"/>
+      <w:spacing w:after="100" w:line="240" w:lineRule="auto" w:before="160"/>
       <w:contextualSpacing/>
     </w:pPr>
     <w:rPr>
-      <w:rFonts w:asciiTheme="majorHAnsi" w:eastAsiaTheme="majorEastAsia" w:hAnsiTheme="majorHAnsi" w:cstheme="majorBidi"/>
-      <w:color w:val="17365D" w:themeColor="text2" w:themeShade="BF"/>
+      <w:rFonts w:asciiTheme="majorHAnsi" w:eastAsiaTheme="majorEastAsia" w:hAnsiTheme="majorHAnsi" w:cstheme="majorBidi" w:ascii="Aptos Display" w:hAnsi="Aptos Display"/>
+      <w:b/>
+      <w:color w:val="17365D"/>
       <w:spacing w:val="5"/>
       <w:kern w:val="28"/>
-      <w:sz w:val="52"/>
+      <w:sz w:val="44"/>
       <w:szCs w:val="52"/>
     </w:rPr>
   </w:style>

</xml_diff>